<commit_message>
Add HTML presentation, set author and professors
Co-Authored-By: Claude Opus 5.5 <noreply@anthropic.com>
</commit_message>
<xml_diff>
--- a/reports/informe_final.docx
+++ b/reports/informe_final.docx
@@ -34,7 +34,7 @@
         <w:jc w:val="center"/>
       </w:pPr>
       <w:r>
-        <w:t>Docente: [COMPLETAR]</w:t>
+        <w:t>Docentes: Juan Azcurra · Paul Pablo Hernán</w:t>
       </w:r>
     </w:p>
     <w:p>
@@ -42,7 +42,7 @@
         <w:jc w:val="center"/>
       </w:pPr>
       <w:r>
-        <w:t>Integrantes: [COMPLETAR NOMBRE 1] · [COMPLETAR NOMBRE 2] · [COMPLETAR NOMBRE 3]</w:t>
+        <w:t>Autor: Fernando Caceres</w:t>
       </w:r>
     </w:p>
     <w:p>

</xml_diff>